<commit_message>
export and time update
</commit_message>
<xml_diff>
--- a/templates/email_request_template.docx
+++ b/templates/email_request_template.docx
@@ -270,16 +270,9 @@
           <w:rFonts w:ascii="Cambria" w:eastAsia="Cambria" w:hAnsi="Cambria" w:cs="Cambria"/>
           <w:sz w:val="24"/>
           <w:szCs w:val="24"/>
-        </w:rPr>
-        <w:t>${</w:t>
-      </w:r>
-      <w:r>
-        <w:rPr>
-          <w:rFonts w:ascii="Cambria" w:eastAsia="Cambria" w:hAnsi="Cambria" w:cs="Cambria"/>
-          <w:sz w:val="24"/>
-          <w:szCs w:val="24"/>
-        </w:rPr>
-        <w:t>DATE}</w:t>
+          <w:u w:val="single"/>
+        </w:rPr>
+        <w:t>${DATE}</w:t>
       </w:r>
       <w:r>
         <w:rPr>
@@ -499,23 +492,7 @@
                 <w:sz w:val="24"/>
                 <w:szCs w:val="24"/>
               </w:rPr>
-              <w:t>${</w:t>
-            </w:r>
-            <w:r>
-              <w:rPr>
-                <w:rFonts w:ascii="Cambria" w:eastAsia="Cambria" w:hAnsi="Cambria" w:cs="Cambria"/>
-                <w:sz w:val="24"/>
-                <w:szCs w:val="24"/>
-              </w:rPr>
-              <w:t>F</w:t>
-            </w:r>
-            <w:r>
-              <w:rPr>
-                <w:rFonts w:ascii="Cambria" w:eastAsia="Cambria" w:hAnsi="Cambria" w:cs="Cambria"/>
-                <w:sz w:val="24"/>
-                <w:szCs w:val="24"/>
-              </w:rPr>
-              <w:t>NAME1}</w:t>
+              <w:t>${FNAME1}</w:t>
             </w:r>
           </w:p>
         </w:tc>
@@ -539,23 +516,7 @@
                 <w:sz w:val="24"/>
                 <w:szCs w:val="24"/>
               </w:rPr>
-              <w:t>${</w:t>
-            </w:r>
-            <w:r>
-              <w:rPr>
-                <w:rFonts w:ascii="Cambria" w:eastAsia="Cambria" w:hAnsi="Cambria" w:cs="Cambria"/>
-                <w:sz w:val="24"/>
-                <w:szCs w:val="24"/>
-              </w:rPr>
-              <w:t>M</w:t>
-            </w:r>
-            <w:r>
-              <w:rPr>
-                <w:rFonts w:ascii="Cambria" w:eastAsia="Cambria" w:hAnsi="Cambria" w:cs="Cambria"/>
-                <w:sz w:val="24"/>
-                <w:szCs w:val="24"/>
-              </w:rPr>
-              <w:t>NAME1}</w:t>
+              <w:t>${MNAME1}</w:t>
             </w:r>
           </w:p>
         </w:tc>
@@ -579,23 +540,7 @@
                 <w:sz w:val="24"/>
                 <w:szCs w:val="24"/>
               </w:rPr>
-              <w:t>${</w:t>
-            </w:r>
-            <w:r>
-              <w:rPr>
-                <w:rFonts w:ascii="Cambria" w:eastAsia="Cambria" w:hAnsi="Cambria" w:cs="Cambria"/>
-                <w:sz w:val="24"/>
-                <w:szCs w:val="24"/>
-              </w:rPr>
-              <w:t>DEPT</w:t>
-            </w:r>
-            <w:r>
-              <w:rPr>
-                <w:rFonts w:ascii="Cambria" w:eastAsia="Cambria" w:hAnsi="Cambria" w:cs="Cambria"/>
-                <w:sz w:val="24"/>
-                <w:szCs w:val="24"/>
-              </w:rPr>
-              <w:t>1}</w:t>
+              <w:t>${DEPT1}</w:t>
             </w:r>
           </w:p>
         </w:tc>
@@ -624,23 +569,7 @@
                 <w:sz w:val="24"/>
                 <w:szCs w:val="24"/>
               </w:rPr>
-              <w:t>${LNAME</w:t>
-            </w:r>
-            <w:r>
-              <w:rPr>
-                <w:rFonts w:ascii="Cambria" w:eastAsia="Cambria" w:hAnsi="Cambria" w:cs="Cambria"/>
-                <w:sz w:val="24"/>
-                <w:szCs w:val="24"/>
-              </w:rPr>
-              <w:t>2</w:t>
-            </w:r>
-            <w:r>
-              <w:rPr>
-                <w:rFonts w:ascii="Cambria" w:eastAsia="Cambria" w:hAnsi="Cambria" w:cs="Cambria"/>
-                <w:sz w:val="24"/>
-                <w:szCs w:val="24"/>
-              </w:rPr>
-              <w:t>}</w:t>
+              <w:t>${LNAME2}</w:t>
             </w:r>
           </w:p>
         </w:tc>
@@ -664,39 +593,7 @@
                 <w:sz w:val="24"/>
                 <w:szCs w:val="24"/>
               </w:rPr>
-              <w:t>${</w:t>
-            </w:r>
-            <w:r>
-              <w:rPr>
-                <w:rFonts w:ascii="Cambria" w:eastAsia="Cambria" w:hAnsi="Cambria" w:cs="Cambria"/>
-                <w:sz w:val="24"/>
-                <w:szCs w:val="24"/>
-              </w:rPr>
-              <w:t>F</w:t>
-            </w:r>
-            <w:r>
-              <w:rPr>
-                <w:rFonts w:ascii="Cambria" w:eastAsia="Cambria" w:hAnsi="Cambria" w:cs="Cambria"/>
-                <w:sz w:val="24"/>
-                <w:szCs w:val="24"/>
-              </w:rPr>
-              <w:t>NAME</w:t>
-            </w:r>
-            <w:r>
-              <w:rPr>
-                <w:rFonts w:ascii="Cambria" w:eastAsia="Cambria" w:hAnsi="Cambria" w:cs="Cambria"/>
-                <w:sz w:val="24"/>
-                <w:szCs w:val="24"/>
-              </w:rPr>
-              <w:t>2</w:t>
-            </w:r>
-            <w:r>
-              <w:rPr>
-                <w:rFonts w:ascii="Cambria" w:eastAsia="Cambria" w:hAnsi="Cambria" w:cs="Cambria"/>
-                <w:sz w:val="24"/>
-                <w:szCs w:val="24"/>
-              </w:rPr>
-              <w:t>}</w:t>
+              <w:t>${FNAME2}</w:t>
             </w:r>
           </w:p>
         </w:tc>
@@ -720,23 +617,7 @@
                 <w:sz w:val="24"/>
                 <w:szCs w:val="24"/>
               </w:rPr>
-              <w:t>${MNAME</w:t>
-            </w:r>
-            <w:r>
-              <w:rPr>
-                <w:rFonts w:ascii="Cambria" w:eastAsia="Cambria" w:hAnsi="Cambria" w:cs="Cambria"/>
-                <w:sz w:val="24"/>
-                <w:szCs w:val="24"/>
-              </w:rPr>
-              <w:t>2</w:t>
-            </w:r>
-            <w:r>
-              <w:rPr>
-                <w:rFonts w:ascii="Cambria" w:eastAsia="Cambria" w:hAnsi="Cambria" w:cs="Cambria"/>
-                <w:sz w:val="24"/>
-                <w:szCs w:val="24"/>
-              </w:rPr>
-              <w:t>}</w:t>
+              <w:t>${MNAME2}</w:t>
             </w:r>
           </w:p>
         </w:tc>
@@ -760,23 +641,7 @@
                 <w:sz w:val="24"/>
                 <w:szCs w:val="24"/>
               </w:rPr>
-              <w:t>${</w:t>
-            </w:r>
-            <w:r>
-              <w:rPr>
-                <w:rFonts w:ascii="Cambria" w:eastAsia="Cambria" w:hAnsi="Cambria" w:cs="Cambria"/>
-                <w:sz w:val="24"/>
-                <w:szCs w:val="24"/>
-              </w:rPr>
-              <w:t>DEPT2</w:t>
-            </w:r>
-            <w:r>
-              <w:rPr>
-                <w:rFonts w:ascii="Cambria" w:eastAsia="Cambria" w:hAnsi="Cambria" w:cs="Cambria"/>
-                <w:sz w:val="24"/>
-                <w:szCs w:val="24"/>
-              </w:rPr>
-              <w:t>}</w:t>
+              <w:t>${DEPT2}</w:t>
             </w:r>
           </w:p>
         </w:tc>
@@ -805,23 +670,7 @@
                 <w:sz w:val="24"/>
                 <w:szCs w:val="24"/>
               </w:rPr>
-              <w:t>${LNAME</w:t>
-            </w:r>
-            <w:r>
-              <w:rPr>
-                <w:rFonts w:ascii="Cambria" w:eastAsia="Cambria" w:hAnsi="Cambria" w:cs="Cambria"/>
-                <w:sz w:val="24"/>
-                <w:szCs w:val="24"/>
-              </w:rPr>
-              <w:t>3</w:t>
-            </w:r>
-            <w:r>
-              <w:rPr>
-                <w:rFonts w:ascii="Cambria" w:eastAsia="Cambria" w:hAnsi="Cambria" w:cs="Cambria"/>
-                <w:sz w:val="24"/>
-                <w:szCs w:val="24"/>
-              </w:rPr>
-              <w:t>}</w:t>
+              <w:t>${LNAME3}</w:t>
             </w:r>
           </w:p>
         </w:tc>
@@ -845,39 +694,7 @@
                 <w:sz w:val="24"/>
                 <w:szCs w:val="24"/>
               </w:rPr>
-              <w:t>${</w:t>
-            </w:r>
-            <w:r>
-              <w:rPr>
-                <w:rFonts w:ascii="Cambria" w:eastAsia="Cambria" w:hAnsi="Cambria" w:cs="Cambria"/>
-                <w:sz w:val="24"/>
-                <w:szCs w:val="24"/>
-              </w:rPr>
-              <w:t>F</w:t>
-            </w:r>
-            <w:r>
-              <w:rPr>
-                <w:rFonts w:ascii="Cambria" w:eastAsia="Cambria" w:hAnsi="Cambria" w:cs="Cambria"/>
-                <w:sz w:val="24"/>
-                <w:szCs w:val="24"/>
-              </w:rPr>
-              <w:t>NAME</w:t>
-            </w:r>
-            <w:r>
-              <w:rPr>
-                <w:rFonts w:ascii="Cambria" w:eastAsia="Cambria" w:hAnsi="Cambria" w:cs="Cambria"/>
-                <w:sz w:val="24"/>
-                <w:szCs w:val="24"/>
-              </w:rPr>
-              <w:t>3</w:t>
-            </w:r>
-            <w:r>
-              <w:rPr>
-                <w:rFonts w:ascii="Cambria" w:eastAsia="Cambria" w:hAnsi="Cambria" w:cs="Cambria"/>
-                <w:sz w:val="24"/>
-                <w:szCs w:val="24"/>
-              </w:rPr>
-              <w:t>}</w:t>
+              <w:t>${FNAME3}</w:t>
             </w:r>
           </w:p>
         </w:tc>
@@ -901,23 +718,7 @@
                 <w:sz w:val="24"/>
                 <w:szCs w:val="24"/>
               </w:rPr>
-              <w:t>${MNAME</w:t>
-            </w:r>
-            <w:r>
-              <w:rPr>
-                <w:rFonts w:ascii="Cambria" w:eastAsia="Cambria" w:hAnsi="Cambria" w:cs="Cambria"/>
-                <w:sz w:val="24"/>
-                <w:szCs w:val="24"/>
-              </w:rPr>
-              <w:t>3</w:t>
-            </w:r>
-            <w:r>
-              <w:rPr>
-                <w:rFonts w:ascii="Cambria" w:eastAsia="Cambria" w:hAnsi="Cambria" w:cs="Cambria"/>
-                <w:sz w:val="24"/>
-                <w:szCs w:val="24"/>
-              </w:rPr>
-              <w:t>}</w:t>
+              <w:t>${MNAME3}</w:t>
             </w:r>
           </w:p>
         </w:tc>
@@ -941,23 +742,7 @@
                 <w:sz w:val="24"/>
                 <w:szCs w:val="24"/>
               </w:rPr>
-              <w:t>${</w:t>
-            </w:r>
-            <w:r>
-              <w:rPr>
-                <w:rFonts w:ascii="Cambria" w:eastAsia="Cambria" w:hAnsi="Cambria" w:cs="Cambria"/>
-                <w:sz w:val="24"/>
-                <w:szCs w:val="24"/>
-              </w:rPr>
-              <w:t>DEPT3</w:t>
-            </w:r>
-            <w:r>
-              <w:rPr>
-                <w:rFonts w:ascii="Cambria" w:eastAsia="Cambria" w:hAnsi="Cambria" w:cs="Cambria"/>
-                <w:sz w:val="24"/>
-                <w:szCs w:val="24"/>
-              </w:rPr>
-              <w:t>}</w:t>
+              <w:t>${DEPT3}</w:t>
             </w:r>
           </w:p>
         </w:tc>
@@ -986,23 +771,7 @@
                 <w:sz w:val="24"/>
                 <w:szCs w:val="24"/>
               </w:rPr>
-              <w:t>${LNAME</w:t>
-            </w:r>
-            <w:r>
-              <w:rPr>
-                <w:rFonts w:ascii="Cambria" w:eastAsia="Cambria" w:hAnsi="Cambria" w:cs="Cambria"/>
-                <w:sz w:val="24"/>
-                <w:szCs w:val="24"/>
-              </w:rPr>
-              <w:t>4</w:t>
-            </w:r>
-            <w:r>
-              <w:rPr>
-                <w:rFonts w:ascii="Cambria" w:eastAsia="Cambria" w:hAnsi="Cambria" w:cs="Cambria"/>
-                <w:sz w:val="24"/>
-                <w:szCs w:val="24"/>
-              </w:rPr>
-              <w:t>}</w:t>
+              <w:t>${LNAME4}</w:t>
             </w:r>
           </w:p>
         </w:tc>
@@ -1026,39 +795,7 @@
                 <w:sz w:val="24"/>
                 <w:szCs w:val="24"/>
               </w:rPr>
-              <w:t>${</w:t>
-            </w:r>
-            <w:r>
-              <w:rPr>
-                <w:rFonts w:ascii="Cambria" w:eastAsia="Cambria" w:hAnsi="Cambria" w:cs="Cambria"/>
-                <w:sz w:val="24"/>
-                <w:szCs w:val="24"/>
-              </w:rPr>
-              <w:t>F</w:t>
-            </w:r>
-            <w:r>
-              <w:rPr>
-                <w:rFonts w:ascii="Cambria" w:eastAsia="Cambria" w:hAnsi="Cambria" w:cs="Cambria"/>
-                <w:sz w:val="24"/>
-                <w:szCs w:val="24"/>
-              </w:rPr>
-              <w:t>NAME</w:t>
-            </w:r>
-            <w:r>
-              <w:rPr>
-                <w:rFonts w:ascii="Cambria" w:eastAsia="Cambria" w:hAnsi="Cambria" w:cs="Cambria"/>
-                <w:sz w:val="24"/>
-                <w:szCs w:val="24"/>
-              </w:rPr>
-              <w:t>4</w:t>
-            </w:r>
-            <w:r>
-              <w:rPr>
-                <w:rFonts w:ascii="Cambria" w:eastAsia="Cambria" w:hAnsi="Cambria" w:cs="Cambria"/>
-                <w:sz w:val="24"/>
-                <w:szCs w:val="24"/>
-              </w:rPr>
-              <w:t>}</w:t>
+              <w:t>${FNAME4}</w:t>
             </w:r>
           </w:p>
         </w:tc>
@@ -1082,23 +819,7 @@
                 <w:sz w:val="24"/>
                 <w:szCs w:val="24"/>
               </w:rPr>
-              <w:t>${MNAME</w:t>
-            </w:r>
-            <w:r>
-              <w:rPr>
-                <w:rFonts w:ascii="Cambria" w:eastAsia="Cambria" w:hAnsi="Cambria" w:cs="Cambria"/>
-                <w:sz w:val="24"/>
-                <w:szCs w:val="24"/>
-              </w:rPr>
-              <w:t>4</w:t>
-            </w:r>
-            <w:r>
-              <w:rPr>
-                <w:rFonts w:ascii="Cambria" w:eastAsia="Cambria" w:hAnsi="Cambria" w:cs="Cambria"/>
-                <w:sz w:val="24"/>
-                <w:szCs w:val="24"/>
-              </w:rPr>
-              <w:t>}</w:t>
+              <w:t>${MNAME4}</w:t>
             </w:r>
           </w:p>
         </w:tc>
@@ -1122,23 +843,7 @@
                 <w:sz w:val="24"/>
                 <w:szCs w:val="24"/>
               </w:rPr>
-              <w:t>${</w:t>
-            </w:r>
-            <w:r>
-              <w:rPr>
-                <w:rFonts w:ascii="Cambria" w:eastAsia="Cambria" w:hAnsi="Cambria" w:cs="Cambria"/>
-                <w:sz w:val="24"/>
-                <w:szCs w:val="24"/>
-              </w:rPr>
-              <w:t>DEPT4</w:t>
-            </w:r>
-            <w:r>
-              <w:rPr>
-                <w:rFonts w:ascii="Cambria" w:eastAsia="Cambria" w:hAnsi="Cambria" w:cs="Cambria"/>
-                <w:sz w:val="24"/>
-                <w:szCs w:val="24"/>
-              </w:rPr>
-              <w:t>}</w:t>
+              <w:t>${DEPT4}</w:t>
             </w:r>
           </w:p>
         </w:tc>
@@ -1167,23 +872,7 @@
                 <w:sz w:val="24"/>
                 <w:szCs w:val="24"/>
               </w:rPr>
-              <w:t>${LNAME</w:t>
-            </w:r>
-            <w:r>
-              <w:rPr>
-                <w:rFonts w:ascii="Cambria" w:eastAsia="Cambria" w:hAnsi="Cambria" w:cs="Cambria"/>
-                <w:sz w:val="24"/>
-                <w:szCs w:val="24"/>
-              </w:rPr>
-              <w:t>5</w:t>
-            </w:r>
-            <w:r>
-              <w:rPr>
-                <w:rFonts w:ascii="Cambria" w:eastAsia="Cambria" w:hAnsi="Cambria" w:cs="Cambria"/>
-                <w:sz w:val="24"/>
-                <w:szCs w:val="24"/>
-              </w:rPr>
-              <w:t>}</w:t>
+              <w:t>${LNAME5}</w:t>
             </w:r>
           </w:p>
         </w:tc>
@@ -1207,39 +896,7 @@
                 <w:sz w:val="24"/>
                 <w:szCs w:val="24"/>
               </w:rPr>
-              <w:t>${</w:t>
-            </w:r>
-            <w:r>
-              <w:rPr>
-                <w:rFonts w:ascii="Cambria" w:eastAsia="Cambria" w:hAnsi="Cambria" w:cs="Cambria"/>
-                <w:sz w:val="24"/>
-                <w:szCs w:val="24"/>
-              </w:rPr>
-              <w:t>F</w:t>
-            </w:r>
-            <w:r>
-              <w:rPr>
-                <w:rFonts w:ascii="Cambria" w:eastAsia="Cambria" w:hAnsi="Cambria" w:cs="Cambria"/>
-                <w:sz w:val="24"/>
-                <w:szCs w:val="24"/>
-              </w:rPr>
-              <w:t>NAME</w:t>
-            </w:r>
-            <w:r>
-              <w:rPr>
-                <w:rFonts w:ascii="Cambria" w:eastAsia="Cambria" w:hAnsi="Cambria" w:cs="Cambria"/>
-                <w:sz w:val="24"/>
-                <w:szCs w:val="24"/>
-              </w:rPr>
-              <w:t>5</w:t>
-            </w:r>
-            <w:r>
-              <w:rPr>
-                <w:rFonts w:ascii="Cambria" w:eastAsia="Cambria" w:hAnsi="Cambria" w:cs="Cambria"/>
-                <w:sz w:val="24"/>
-                <w:szCs w:val="24"/>
-              </w:rPr>
-              <w:t>}</w:t>
+              <w:t>${FNAME5}</w:t>
             </w:r>
           </w:p>
         </w:tc>
@@ -1263,23 +920,7 @@
                 <w:sz w:val="24"/>
                 <w:szCs w:val="24"/>
               </w:rPr>
-              <w:t>${MNAME</w:t>
-            </w:r>
-            <w:r>
-              <w:rPr>
-                <w:rFonts w:ascii="Cambria" w:eastAsia="Cambria" w:hAnsi="Cambria" w:cs="Cambria"/>
-                <w:sz w:val="24"/>
-                <w:szCs w:val="24"/>
-              </w:rPr>
-              <w:t>5</w:t>
-            </w:r>
-            <w:r>
-              <w:rPr>
-                <w:rFonts w:ascii="Cambria" w:eastAsia="Cambria" w:hAnsi="Cambria" w:cs="Cambria"/>
-                <w:sz w:val="24"/>
-                <w:szCs w:val="24"/>
-              </w:rPr>
-              <w:t>}</w:t>
+              <w:t>${MNAME5}</w:t>
             </w:r>
           </w:p>
         </w:tc>
@@ -1303,23 +944,7 @@
                 <w:sz w:val="24"/>
                 <w:szCs w:val="24"/>
               </w:rPr>
-              <w:t>${</w:t>
-            </w:r>
-            <w:r>
-              <w:rPr>
-                <w:rFonts w:ascii="Cambria" w:eastAsia="Cambria" w:hAnsi="Cambria" w:cs="Cambria"/>
-                <w:sz w:val="24"/>
-                <w:szCs w:val="24"/>
-              </w:rPr>
-              <w:t>DEPT5</w:t>
-            </w:r>
-            <w:r>
-              <w:rPr>
-                <w:rFonts w:ascii="Cambria" w:eastAsia="Cambria" w:hAnsi="Cambria" w:cs="Cambria"/>
-                <w:sz w:val="24"/>
-                <w:szCs w:val="24"/>
-              </w:rPr>
-              <w:t>}</w:t>
+              <w:t>${DEPT5}</w:t>
             </w:r>
           </w:p>
         </w:tc>
@@ -1932,23 +1557,7 @@
                 <w:sz w:val="24"/>
                 <w:szCs w:val="24"/>
               </w:rPr>
-              <w:t>${</w:t>
-            </w:r>
-            <w:r>
-              <w:rPr>
-                <w:rFonts w:ascii="Cambria" w:eastAsia="Cambria" w:hAnsi="Cambria" w:cs="Cambria"/>
-                <w:sz w:val="24"/>
-                <w:szCs w:val="24"/>
-              </w:rPr>
-              <w:t>EMAIL</w:t>
-            </w:r>
-            <w:r>
-              <w:rPr>
-                <w:rFonts w:ascii="Cambria" w:eastAsia="Cambria" w:hAnsi="Cambria" w:cs="Cambria"/>
-                <w:sz w:val="24"/>
-                <w:szCs w:val="24"/>
-              </w:rPr>
-              <w:t>1}</w:t>
+              <w:t>${EMAIL1}</w:t>
             </w:r>
           </w:p>
         </w:tc>
@@ -1972,23 +1581,7 @@
                 <w:sz w:val="24"/>
                 <w:szCs w:val="24"/>
               </w:rPr>
-              <w:t>${</w:t>
-            </w:r>
-            <w:r>
-              <w:rPr>
-                <w:rFonts w:ascii="Cambria" w:eastAsia="Cambria" w:hAnsi="Cambria" w:cs="Cambria"/>
-                <w:sz w:val="24"/>
-                <w:szCs w:val="24"/>
-              </w:rPr>
-              <w:t>PASS</w:t>
-            </w:r>
-            <w:r>
-              <w:rPr>
-                <w:rFonts w:ascii="Cambria" w:eastAsia="Cambria" w:hAnsi="Cambria" w:cs="Cambria"/>
-                <w:sz w:val="24"/>
-                <w:szCs w:val="24"/>
-              </w:rPr>
-              <w:t>1}</w:t>
+              <w:t>${PASS1}</w:t>
             </w:r>
           </w:p>
         </w:tc>
@@ -2017,23 +1610,7 @@
                 <w:sz w:val="24"/>
                 <w:szCs w:val="24"/>
               </w:rPr>
-              <w:t>${EMAIL</w:t>
-            </w:r>
-            <w:r>
-              <w:rPr>
-                <w:rFonts w:ascii="Cambria" w:eastAsia="Cambria" w:hAnsi="Cambria" w:cs="Cambria"/>
-                <w:sz w:val="24"/>
-                <w:szCs w:val="24"/>
-              </w:rPr>
-              <w:t>2</w:t>
-            </w:r>
-            <w:r>
-              <w:rPr>
-                <w:rFonts w:ascii="Cambria" w:eastAsia="Cambria" w:hAnsi="Cambria" w:cs="Cambria"/>
-                <w:sz w:val="24"/>
-                <w:szCs w:val="24"/>
-              </w:rPr>
-              <w:t>}</w:t>
+              <w:t>${EMAIL2}</w:t>
             </w:r>
           </w:p>
         </w:tc>
@@ -2057,23 +1634,7 @@
                 <w:sz w:val="24"/>
                 <w:szCs w:val="24"/>
               </w:rPr>
-              <w:t>${PASS</w:t>
-            </w:r>
-            <w:r>
-              <w:rPr>
-                <w:rFonts w:ascii="Cambria" w:eastAsia="Cambria" w:hAnsi="Cambria" w:cs="Cambria"/>
-                <w:sz w:val="24"/>
-                <w:szCs w:val="24"/>
-              </w:rPr>
-              <w:t>2</w:t>
-            </w:r>
-            <w:r>
-              <w:rPr>
-                <w:rFonts w:ascii="Cambria" w:eastAsia="Cambria" w:hAnsi="Cambria" w:cs="Cambria"/>
-                <w:sz w:val="24"/>
-                <w:szCs w:val="24"/>
-              </w:rPr>
-              <w:t>}</w:t>
+              <w:t>${PASS2}</w:t>
             </w:r>
           </w:p>
         </w:tc>
@@ -2102,23 +1663,7 @@
                 <w:sz w:val="24"/>
                 <w:szCs w:val="24"/>
               </w:rPr>
-              <w:t>${EMAIL</w:t>
-            </w:r>
-            <w:r>
-              <w:rPr>
-                <w:rFonts w:ascii="Cambria" w:eastAsia="Cambria" w:hAnsi="Cambria" w:cs="Cambria"/>
-                <w:sz w:val="24"/>
-                <w:szCs w:val="24"/>
-              </w:rPr>
-              <w:t>3</w:t>
-            </w:r>
-            <w:r>
-              <w:rPr>
-                <w:rFonts w:ascii="Cambria" w:eastAsia="Cambria" w:hAnsi="Cambria" w:cs="Cambria"/>
-                <w:sz w:val="24"/>
-                <w:szCs w:val="24"/>
-              </w:rPr>
-              <w:t>}</w:t>
+              <w:t>${EMAIL3}</w:t>
             </w:r>
           </w:p>
         </w:tc>
@@ -2142,23 +1687,7 @@
                 <w:sz w:val="24"/>
                 <w:szCs w:val="24"/>
               </w:rPr>
-              <w:t>${PASS</w:t>
-            </w:r>
-            <w:r>
-              <w:rPr>
-                <w:rFonts w:ascii="Cambria" w:eastAsia="Cambria" w:hAnsi="Cambria" w:cs="Cambria"/>
-                <w:sz w:val="24"/>
-                <w:szCs w:val="24"/>
-              </w:rPr>
-              <w:t>3</w:t>
-            </w:r>
-            <w:r>
-              <w:rPr>
-                <w:rFonts w:ascii="Cambria" w:eastAsia="Cambria" w:hAnsi="Cambria" w:cs="Cambria"/>
-                <w:sz w:val="24"/>
-                <w:szCs w:val="24"/>
-              </w:rPr>
-              <w:t>}</w:t>
+              <w:t>${PASS3}</w:t>
             </w:r>
           </w:p>
         </w:tc>
@@ -2377,7 +1906,101 @@
           <w:sz w:val="16"/>
           <w:szCs w:val="16"/>
         </w:rPr>
-        <w:t>Date/Time Received: ___________________________ Date/Time Processed: ________________________ Date/Time Accomplished: _________________________</w:t>
+        <w:t xml:space="preserve">Date/Time Received: </w:t>
+      </w:r>
+      <w:r>
+        <w:rPr>
+          <w:rFonts w:ascii="Cambria" w:hAnsi="Cambria" w:cs="Menlo"/>
+          <w:color w:val="1F2328"/>
+          <w:sz w:val="16"/>
+          <w:szCs w:val="16"/>
+          <w:u w:val="single"/>
+        </w:rPr>
+        <w:t>${RECEIVED1}</w:t>
+      </w:r>
+      <w:r>
+        <w:rPr>
+          <w:rFonts w:ascii="Menlo" w:hAnsi="Menlo" w:cs="Menlo"/>
+          <w:color w:val="1F2328"/>
+          <w:sz w:val="20"/>
+          <w:szCs w:val="20"/>
+        </w:rPr>
+        <w:t xml:space="preserve"> </w:t>
+      </w:r>
+      <w:r>
+        <w:rPr>
+          <w:rFonts w:ascii="Menlo" w:hAnsi="Menlo" w:cs="Menlo"/>
+          <w:color w:val="1F2328"/>
+          <w:sz w:val="20"/>
+          <w:szCs w:val="20"/>
+        </w:rPr>
+        <w:tab/>
+      </w:r>
+      <w:r>
+        <w:rPr>
+          <w:rFonts w:ascii="Cambria" w:eastAsia="Cambria" w:hAnsi="Cambria" w:cs="Cambria"/>
+          <w:sz w:val="16"/>
+          <w:szCs w:val="16"/>
+        </w:rPr>
+        <w:t xml:space="preserve">Date/Time Processed: </w:t>
+      </w:r>
+      <w:r>
+        <w:rPr>
+          <w:rFonts w:ascii="Cambria" w:hAnsi="Cambria" w:cs="Menlo"/>
+          <w:color w:val="1F2328"/>
+          <w:sz w:val="16"/>
+          <w:szCs w:val="16"/>
+          <w:u w:val="single"/>
+        </w:rPr>
+        <w:t>${PROCESSED1</w:t>
+      </w:r>
+      <w:proofErr w:type="gramStart"/>
+      <w:r>
+        <w:rPr>
+          <w:rFonts w:ascii="Cambria" w:hAnsi="Cambria" w:cs="Menlo"/>
+          <w:color w:val="1F2328"/>
+          <w:sz w:val="16"/>
+          <w:szCs w:val="16"/>
+          <w:u w:val="single"/>
+        </w:rPr>
+        <w:t>}</w:t>
+      </w:r>
+      <w:r>
+        <w:rPr>
+          <w:rFonts w:ascii="Cambria" w:hAnsi="Cambria" w:cs="Menlo"/>
+          <w:color w:val="1F2328"/>
+          <w:sz w:val="16"/>
+          <w:szCs w:val="16"/>
+        </w:rPr>
+        <w:t xml:space="preserve">  </w:t>
+      </w:r>
+      <w:r>
+        <w:rPr>
+          <w:rFonts w:ascii="Cambria" w:hAnsi="Cambria" w:cs="Menlo"/>
+          <w:color w:val="1F2328"/>
+          <w:sz w:val="16"/>
+          <w:szCs w:val="16"/>
+        </w:rPr>
+        <w:tab/>
+      </w:r>
+      <w:proofErr w:type="gramEnd"/>
+      <w:r>
+        <w:rPr>
+          <w:rFonts w:ascii="Cambria" w:eastAsia="Cambria" w:hAnsi="Cambria" w:cs="Cambria"/>
+          <w:sz w:val="16"/>
+          <w:szCs w:val="16"/>
+        </w:rPr>
+        <w:t xml:space="preserve">Date/Time Accomplished: </w:t>
+      </w:r>
+      <w:r>
+        <w:rPr>
+          <w:rFonts w:ascii="Cambria" w:hAnsi="Cambria" w:cs="Menlo"/>
+          <w:color w:val="1F2328"/>
+          <w:sz w:val="16"/>
+          <w:szCs w:val="16"/>
+          <w:u w:val="single"/>
+        </w:rPr>
+        <w:t>${ACCOMPLISHED1}</w:t>
       </w:r>
     </w:p>
     <w:p>
@@ -4818,28 +4441,28 @@
 </file>
 
 <file path=customXml/item1.xml><?xml version="1.0" encoding="utf-8"?>
-<b:Sources xmlns:b="http://schemas.openxmlformats.org/officeDocument/2006/bibliography" xmlns="http://schemas.openxmlformats.org/officeDocument/2006/bibliography" SelectedStyle="\APASixthEditionOfficeOnline.xsl" StyleName="APA" Version="6"/>
-</file>
-
-<file path=customXml/item2.xml><?xml version="1.0" encoding="utf-8"?>
 <go:gDocsCustomXmlDataStorage xmlns:go="http://customooxmlschemas.google.com/" xmlns:r="http://schemas.openxmlformats.org/officeDocument/2006/relationships" uri="GoogleDocsCustomDataVersion2">
   <go:docsCustomData xmlns:go="http://customooxmlschemas.google.com/" roundtripDataSignature="AMtx7mgEzKcoNpwBPgDheY83No810qOCUw==">CgMxLjA4AHIhMTM4NGFLaDFLbV93UkNhUDhoMENCa1Y2dEJFWGpfTURE</go:docsCustomData>
 </go:gDocsCustomXmlDataStorage>
 </file>
 
-<file path=customXml/itemProps1.xml><?xml version="1.0" encoding="utf-8"?>
-<ds:datastoreItem xmlns:ds="http://schemas.openxmlformats.org/officeDocument/2006/customXml" ds:itemID="{FF833183-4665-4EE3-BCBB-997064594DB2}">
-  <ds:schemaRefs>
-    <ds:schemaRef ds:uri="http://schemas.openxmlformats.org/officeDocument/2006/bibliography"/>
-  </ds:schemaRefs>
-</ds:datastoreItem>
+<file path=customXml/item2.xml><?xml version="1.0" encoding="utf-8"?>
+<b:Sources xmlns:b="http://schemas.openxmlformats.org/officeDocument/2006/bibliography" xmlns="http://schemas.openxmlformats.org/officeDocument/2006/bibliography" SelectedStyle="\APASixthEditionOfficeOnline.xsl" StyleName="APA" Version="6"/>
 </file>
 
-<file path=customXml/itemProps2.xml><?xml version="1.0" encoding="utf-8"?>
+<file path=customXml/itemProps1.xml><?xml version="1.0" encoding="utf-8"?>
 <ds:datastoreItem xmlns:ds="http://schemas.openxmlformats.org/officeDocument/2006/customXml" ds:itemID="{11111111-1234-1234-1234-123412341234}">
   <ds:schemaRefs>
     <ds:schemaRef ds:uri="http://customooxmlschemas.google.com/"/>
     <ds:schemaRef ds:uri="http://schemas.openxmlformats.org/officeDocument/2006/relationships"/>
   </ds:schemaRefs>
 </ds:datastoreItem>
+</file>
+
+<file path=customXml/itemProps2.xml><?xml version="1.0" encoding="utf-8"?>
+<ds:datastoreItem xmlns:ds="http://schemas.openxmlformats.org/officeDocument/2006/customXml" ds:itemID="{FF833183-4665-4EE3-BCBB-997064594DB2}">
+  <ds:schemaRefs>
+    <ds:schemaRef ds:uri="http://schemas.openxmlformats.org/officeDocument/2006/bibliography"/>
+  </ds:schemaRefs>
+</ds:datastoreItem>
 </file>
</xml_diff>